<commit_message>
Update sample emails document
Co-authored-by: Copilot <223556219+Copilot@users.noreply.github.com>
</commit_message>
<xml_diff>
--- a/documents/Auto_FNOL_Sample_Emails.docx
+++ b/documents/Auto_FNOL_Sample_Emails.docx
@@ -744,6 +744,10 @@
     <w:p>
       <w:pPr>
         <w:pStyle w:val="ListBullet"/>
+        <w:rPr>
+          <w:b/>
+          <w:bCs/>
+        </w:rPr>
       </w:pPr>
       <w:r>
         <w:t>Draft a short internal handoff note to the assigned injury adjuster summarizing the reported injuries, police report, and vehicle-to-confirm issue for Policy POL-00005.</w:t>
@@ -753,6 +757,12 @@
       </w:r>
       <w:r>
         <w:br/>
+      </w:r>
+      <w:r>
+        <w:rPr>
+          <w:b/>
+          <w:bCs/>
+        </w:rPr>
         <w:t>My questions:</w:t>
       </w:r>
     </w:p>
@@ -802,10 +812,7 @@
         <w:t xml:space="preserve"> (If no adjuster comes up -&gt; </w:t>
       </w:r>
       <w:r>
-        <w:t>Pull a list of all BI-certified adjusters regardless of region</w:t>
-      </w:r>
-      <w:r>
-        <w:t>)</w:t>
+        <w:t>Pull a list of all BI-certified adjusters regardless of region)</w:t>
       </w:r>
     </w:p>
     <w:p>
@@ -1177,6 +1184,73 @@
       </w:r>
     </w:p>
     <w:p>
+      <w:pPr>
+        <w:pStyle w:val="ListBullet"/>
+        <w:numPr>
+          <w:ilvl w:val="0"/>
+          <w:numId w:val="0"/>
+        </w:numPr>
+        <w:ind w:left="360" w:hanging="360"/>
+      </w:pPr>
+    </w:p>
+    <w:p>
+      <w:pPr>
+        <w:pStyle w:val="ListBullet"/>
+        <w:numPr>
+          <w:ilvl w:val="0"/>
+          <w:numId w:val="0"/>
+        </w:numPr>
+        <w:ind w:left="360"/>
+        <w:rPr>
+          <w:b/>
+          <w:bCs/>
+        </w:rPr>
+      </w:pPr>
+      <w:r>
+        <w:rPr>
+          <w:b/>
+          <w:bCs/>
+        </w:rPr>
+        <w:t>My questions:</w:t>
+      </w:r>
+    </w:p>
+    <w:p>
+      <w:pPr>
+        <w:pStyle w:val="ListBullet"/>
+      </w:pPr>
+      <w:r>
+        <w:t>Retrieve full policy coverage details for POL-00002 to check collision coverage and any relevant limits.</w:t>
+      </w:r>
+    </w:p>
+    <w:p>
+      <w:pPr>
+        <w:pStyle w:val="ListBullet"/>
+      </w:pPr>
+      <w:r>
+        <w:t>Screen this claim for SIU referral criteria using internal fraud red-flag processes</w:t>
+      </w:r>
+      <w:r>
+        <w:t>/</w:t>
+      </w:r>
+      <w:r>
+        <w:t xml:space="preserve"> </w:t>
+      </w:r>
+      <w:r>
+        <w:t>Does this qualify to be subject to SIU fraud investigation?</w:t>
+      </w:r>
+    </w:p>
+    <w:p>
+      <w:pPr>
+        <w:pStyle w:val="ListBullet"/>
+        <w:tabs>
+          <w:tab w:val="clear" w:pos="360"/>
+        </w:tabs>
+      </w:pPr>
+      <w:r>
+        <w:t>Do both and send to the SIU investigations team at (sagarbathe@microsoft.com)</w:t>
+      </w:r>
+    </w:p>
+    <w:p>
       <w:r>
         <w:br w:type="page"/>
       </w:r>
@@ -2150,6 +2224,9 @@
     <w:abstractNumId w:val="0"/>
   </w:num>
   <w:num w:numId="10" w16cid:durableId="2037466118">
+    <w:abstractNumId w:val="8"/>
+  </w:num>
+  <w:num w:numId="11" w16cid:durableId="639265195">
     <w:abstractNumId w:val="8"/>
   </w:num>
 </w:numbering>

</xml_diff>

<commit_message>
Add Work IQ Mail SIU-routing-change demo to agent instructions
Extends the Triage Agent instructions (agent.mcs.yml) to use the Work IQ Mail tool to search Outlook for recent emails about SIU case routing/ownership changes, demonstrating Work IQ's ability to surface time-sensitive operational updates (e.g., a new SIU team lead) that are not yet reflected in the governed SIU Fraud Referral Playbook. Documents this second Work IQ scenario in the README alongside the existing CAT bulletin example.

Co-authored-by: Copilot <223556219+Copilot@users.noreply.github.com>
</commit_message>
<xml_diff>
--- a/documents/Auto_FNOL_Sample_Emails.docx
+++ b/documents/Auto_FNOL_Sample_Emails.docx
@@ -820,6 +820,14 @@
         <w:pStyle w:val="ListBullet"/>
       </w:pPr>
       <w:r>
+        <w:t>Is there any special guidance for Hurricane Helios auto claims?</w:t>
+      </w:r>
+    </w:p>
+    <w:p>
+      <w:pPr>
+        <w:pStyle w:val="ListBullet"/>
+      </w:pPr>
+      <w:r>
         <w:t xml:space="preserve">Draft an escalation notice to the Claims Supervisor explaining the situation. Send it to </w:t>
       </w:r>
       <w:hyperlink r:id="rId6" w:tgtFrame="_blank" w:tooltip="mailto:sagarbathe@microsoft.com" w:history="1">
@@ -1233,10 +1241,7 @@
         <w:t>/</w:t>
       </w:r>
       <w:r>
-        <w:t xml:space="preserve"> </w:t>
-      </w:r>
-      <w:r>
-        <w:t>Does this qualify to be subject to SIU fraud investigation?</w:t>
+        <w:t xml:space="preserve"> Does this qualify to be subject to SIU fraud investigation?</w:t>
       </w:r>
     </w:p>
     <w:p>

</xml_diff>